<commit_message>
fix: medical record template
</commit_message>
<xml_diff>
--- a/core/src/templates/medical_record_template.docx
+++ b/core/src/templates/medical_record_template.docx
@@ -1251,7 +1251,19 @@
         <w:rPr>
           <w:rFonts w:ascii="Times New Roman" w:eastAsia="Times New Roman" w:hAnsi="Times New Roman" w:cs="Times New Roman"/>
         </w:rPr>
-        <w:t>{{#results}}   {{indicatorName}}{{valueString}} {{valueNumber}}</w:t>
+        <w:t>{{#results}}   {{indicatorName}}</w:t>
+      </w:r>
+      <w:r>
+        <w:rPr>
+          <w:rFonts w:ascii="Times New Roman" w:eastAsia="Times New Roman" w:hAnsi="Times New Roman" w:cs="Times New Roman"/>
+        </w:rPr>
+        <w:t xml:space="preserve">  </w:t>
+      </w:r>
+      <w:r>
+        <w:rPr>
+          <w:rFonts w:ascii="Times New Roman" w:eastAsia="Times New Roman" w:hAnsi="Times New Roman" w:cs="Times New Roman"/>
+        </w:rPr>
+        <w:t>{{valueString}} {{valueNumber}}</w:t>
       </w:r>
       <w:r>
         <w:rPr>
@@ -1263,7 +1275,7 @@
         <w:rPr>
           <w:rFonts w:ascii="Times New Roman" w:eastAsia="Times New Roman" w:hAnsi="Times New Roman" w:cs="Times New Roman"/>
         </w:rPr>
-        <w:t>{{unit}}{{/results}}</w:t>
+        <w:t>{{unit}}</w:t>
       </w:r>
     </w:p>
     <w:p>
@@ -1272,13 +1284,15 @@
         <w:ind w:left="-426" w:right="-437" w:firstLine="1"/>
         <w:contextualSpacing/>
         <w:rPr>
-          <w:b/>
-          <w:bCs/>
-          <w:color w:val="000000"/>
-          <w:sz w:val="20"/>
-          <w:szCs w:val="20"/>
-        </w:rPr>
-      </w:pPr>
+          <w:rFonts w:ascii="Times New Roman" w:eastAsia="Times New Roman" w:hAnsi="Times New Roman" w:cs="Times New Roman"/>
+        </w:rPr>
+      </w:pPr>
+      <w:r>
+        <w:rPr>
+          <w:rFonts w:ascii="Times New Roman" w:eastAsia="Times New Roman" w:hAnsi="Times New Roman" w:cs="Times New Roman"/>
+        </w:rPr>
+        <w:t>{{/results}}</w:t>
+      </w:r>
       <w:r>
         <w:rPr>
           <w:rFonts w:ascii="Times New Roman" w:eastAsia="Times New Roman" w:hAnsi="Times New Roman" w:cs="Times New Roman"/>

</xml_diff>

<commit_message>
fix: missing consultation fee
</commit_message>
<xml_diff>
--- a/core/src/templates/medical_record_template.docx
+++ b/core/src/templates/medical_record_template.docx
@@ -1922,6 +1922,7 @@
           <w:rFonts w:ascii="Times New Roman" w:eastAsia="Times New Roman" w:hAnsi="Times New Roman" w:cs="Times New Roman"/>
           <w:b/>
           <w:bCs/>
+          <w:lang w:val="en-US"/>
         </w:rPr>
       </w:pPr>
       <w:r>
@@ -1933,34 +1934,6 @@
         <w:tab/>
         <w:t>{{doctorName}}</w:t>
       </w:r>
-    </w:p>
-    <w:p>
-      <w:pPr>
-        <w:tabs>
-          <w:tab w:val="left" w:pos="127"/>
-          <w:tab w:val="left" w:pos="6922"/>
-        </w:tabs>
-        <w:spacing w:after="120" w:line="240" w:lineRule="auto"/>
-        <w:ind w:left="-425" w:right="-436"/>
-        <w:rPr>
-          <w:rFonts w:ascii="Times New Roman" w:eastAsia="Times New Roman" w:hAnsi="Times New Roman" w:cs="Times New Roman"/>
-        </w:rPr>
-      </w:pPr>
-    </w:p>
-    <w:p>
-      <w:pPr>
-        <w:tabs>
-          <w:tab w:val="left" w:pos="-157"/>
-          <w:tab w:val="left" w:pos="6922"/>
-        </w:tabs>
-        <w:spacing w:after="120" w:line="240" w:lineRule="auto"/>
-        <w:ind w:left="-425" w:right="-436"/>
-        <w:rPr>
-          <w:rFonts w:ascii="Times New Roman" w:eastAsia="Times New Roman" w:hAnsi="Times New Roman" w:cs="Times New Roman"/>
-          <w:b/>
-          <w:bCs/>
-        </w:rPr>
-      </w:pPr>
     </w:p>
     <w:sectPr>
       <w:footerReference w:type="default" r:id="rId7"/>

</xml_diff>